<commit_message>
Updatet the database and the documentation
Wrote a new routin and method.
Fixed an typo.
</commit_message>
<xml_diff>
--- a/documentation/documentation.docx
+++ b/documentation/documentation.docx
@@ -20,6 +20,15 @@
     </w:p>
     <w:sdt>
       <w:sdtPr>
+        <w:rPr>
+          <w:rFonts w:ascii="Arial" w:eastAsiaTheme="minorHAnsi" w:hAnsi="Arial" w:cstheme="minorBidi"/>
+          <w:color w:val="auto"/>
+          <w:kern w:val="2"/>
+          <w:sz w:val="24"/>
+          <w:szCs w:val="24"/>
+          <w:lang w:eastAsia="en-US"/>
+          <w14:ligatures w14:val="standardContextual"/>
+        </w:rPr>
         <w:id w:val="-1689526822"/>
         <w:docPartObj>
           <w:docPartGallery w:val="Table of Contents"/>
@@ -28,15 +37,8 @@
       </w:sdtPr>
       <w:sdtEndPr>
         <w:rPr>
-          <w:rFonts w:ascii="Arial" w:eastAsiaTheme="minorHAnsi" w:hAnsi="Arial" w:cstheme="minorBidi"/>
           <w:b/>
           <w:bCs/>
-          <w:color w:val="auto"/>
-          <w:kern w:val="2"/>
-          <w:sz w:val="24"/>
-          <w:szCs w:val="24"/>
-          <w:lang w:eastAsia="en-US"/>
-          <w14:ligatures w14:val="standardContextual"/>
         </w:rPr>
       </w:sdtEndPr>
       <w:sdtContent>
@@ -72,7 +74,7 @@
           <w:r>
             <w:fldChar w:fldCharType="separate"/>
           </w:r>
-          <w:hyperlink w:anchor="_Toc221180319" w:history="1">
+          <w:hyperlink w:anchor="_Toc221256824" w:history="1">
             <w:r>
               <w:rPr>
                 <w:rStyle w:val="Hyperlink"/>
@@ -99,7 +101,7 @@
                 <w:noProof/>
                 <w:webHidden/>
               </w:rPr>
-              <w:instrText xml:space="preserve"> PAGEREF _Toc221180319 \h </w:instrText>
+              <w:instrText xml:space="preserve"> PAGEREF _Toc221256824 \h </w:instrText>
             </w:r>
             <w:r>
               <w:rPr>
@@ -146,13 +148,27 @@
               <w14:ligatures w14:val="standardContextual"/>
             </w:rPr>
           </w:pPr>
-          <w:hyperlink w:anchor="_Toc221180320" w:history="1">
+          <w:hyperlink w:anchor="_Toc221256825" w:history="1">
             <w:r>
               <w:rPr>
                 <w:rStyle w:val="Hyperlink"/>
                 <w:noProof/>
               </w:rPr>
-              <w:t>1.1Projektbeschreibung</w:t>
+              <w:t>1.1</w:t>
+            </w:r>
+            <w:r>
+              <w:rPr>
+                <w:rStyle w:val="Hyperlink"/>
+                <w:noProof/>
+              </w:rPr>
+              <w:t xml:space="preserve"> </w:t>
+            </w:r>
+            <w:r>
+              <w:rPr>
+                <w:rStyle w:val="Hyperlink"/>
+                <w:noProof/>
+              </w:rPr>
+              <w:t>Projektbeschreibung</w:t>
             </w:r>
             <w:r>
               <w:rPr>
@@ -173,7 +189,7 @@
                 <w:noProof/>
                 <w:webHidden/>
               </w:rPr>
-              <w:instrText xml:space="preserve"> PAGEREF _Toc221180320 \h </w:instrText>
+              <w:instrText xml:space="preserve"> PAGEREF _Toc221256825 \h </w:instrText>
             </w:r>
             <w:r>
               <w:rPr>
@@ -219,7 +235,7 @@
               <w14:ligatures w14:val="standardContextual"/>
             </w:rPr>
           </w:pPr>
-          <w:hyperlink w:anchor="_Toc221180321" w:history="1">
+          <w:hyperlink w:anchor="_Toc221256826" w:history="1">
             <w:r>
               <w:rPr>
                 <w:rStyle w:val="Hyperlink"/>
@@ -246,7 +262,7 @@
                 <w:noProof/>
                 <w:webHidden/>
               </w:rPr>
-              <w:instrText xml:space="preserve"> PAGEREF _Toc221180321 \h </w:instrText>
+              <w:instrText xml:space="preserve"> PAGEREF _Toc221256826 \h </w:instrText>
             </w:r>
             <w:r>
               <w:rPr>
@@ -292,7 +308,7 @@
               <w14:ligatures w14:val="standardContextual"/>
             </w:rPr>
           </w:pPr>
-          <w:hyperlink w:anchor="_Toc221180322" w:history="1">
+          <w:hyperlink w:anchor="_Toc221256827" w:history="1">
             <w:r>
               <w:rPr>
                 <w:rStyle w:val="Hyperlink"/>
@@ -319,7 +335,7 @@
                 <w:noProof/>
                 <w:webHidden/>
               </w:rPr>
-              <w:instrText xml:space="preserve"> PAGEREF _Toc221180322 \h </w:instrText>
+              <w:instrText xml:space="preserve"> PAGEREF _Toc221256827 \h </w:instrText>
             </w:r>
             <w:r>
               <w:rPr>
@@ -365,7 +381,7 @@
               <w14:ligatures w14:val="standardContextual"/>
             </w:rPr>
           </w:pPr>
-          <w:hyperlink w:anchor="_Toc221180323" w:history="1">
+          <w:hyperlink w:anchor="_Toc221256828" w:history="1">
             <w:r>
               <w:rPr>
                 <w:rStyle w:val="Hyperlink"/>
@@ -392,7 +408,7 @@
                 <w:noProof/>
                 <w:webHidden/>
               </w:rPr>
-              <w:instrText xml:space="preserve"> PAGEREF _Toc221180323 \h </w:instrText>
+              <w:instrText xml:space="preserve"> PAGEREF _Toc221256828 \h </w:instrText>
             </w:r>
             <w:r>
               <w:rPr>
@@ -438,7 +454,7 @@
               <w14:ligatures w14:val="standardContextual"/>
             </w:rPr>
           </w:pPr>
-          <w:hyperlink w:anchor="_Toc221180324" w:history="1">
+          <w:hyperlink w:anchor="_Toc221256829" w:history="1">
             <w:r>
               <w:rPr>
                 <w:rStyle w:val="Hyperlink"/>
@@ -465,7 +481,7 @@
                 <w:noProof/>
                 <w:webHidden/>
               </w:rPr>
-              <w:instrText xml:space="preserve"> PAGEREF _Toc221180324 \h </w:instrText>
+              <w:instrText xml:space="preserve"> PAGEREF _Toc221256829 \h </w:instrText>
             </w:r>
             <w:r>
               <w:rPr>
@@ -511,7 +527,7 @@
               <w14:ligatures w14:val="standardContextual"/>
             </w:rPr>
           </w:pPr>
-          <w:hyperlink w:anchor="_Toc221180325" w:history="1">
+          <w:hyperlink w:anchor="_Toc221256830" w:history="1">
             <w:r>
               <w:rPr>
                 <w:rStyle w:val="Hyperlink"/>
@@ -538,7 +554,7 @@
                 <w:noProof/>
                 <w:webHidden/>
               </w:rPr>
-              <w:instrText xml:space="preserve"> PAGEREF _Toc221180325 \h </w:instrText>
+              <w:instrText xml:space="preserve"> PAGEREF _Toc221256830 \h </w:instrText>
             </w:r>
             <w:r>
               <w:rPr>
@@ -584,7 +600,7 @@
               <w14:ligatures w14:val="standardContextual"/>
             </w:rPr>
           </w:pPr>
-          <w:hyperlink w:anchor="_Toc221180326" w:history="1">
+          <w:hyperlink w:anchor="_Toc221256831" w:history="1">
             <w:r>
               <w:rPr>
                 <w:rStyle w:val="Hyperlink"/>
@@ -611,7 +627,7 @@
                 <w:noProof/>
                 <w:webHidden/>
               </w:rPr>
-              <w:instrText xml:space="preserve"> PAGEREF _Toc221180326 \h </w:instrText>
+              <w:instrText xml:space="preserve"> PAGEREF _Toc221256831 \h </w:instrText>
             </w:r>
             <w:r>
               <w:rPr>
@@ -657,7 +673,7 @@
               <w14:ligatures w14:val="standardContextual"/>
             </w:rPr>
           </w:pPr>
-          <w:hyperlink w:anchor="_Toc221180327" w:history="1">
+          <w:hyperlink w:anchor="_Toc221256832" w:history="1">
             <w:r>
               <w:rPr>
                 <w:rStyle w:val="Hyperlink"/>
@@ -684,7 +700,7 @@
                 <w:noProof/>
                 <w:webHidden/>
               </w:rPr>
-              <w:instrText xml:space="preserve"> PAGEREF _Toc221180327 \h </w:instrText>
+              <w:instrText xml:space="preserve"> PAGEREF _Toc221256832 \h </w:instrText>
             </w:r>
             <w:r>
               <w:rPr>
@@ -705,6 +721,225 @@
                 <w:webHidden/>
               </w:rPr>
               <w:t>2</w:t>
+            </w:r>
+            <w:r>
+              <w:rPr>
+                <w:noProof/>
+                <w:webHidden/>
+              </w:rPr>
+              <w:fldChar w:fldCharType="end"/>
+            </w:r>
+          </w:hyperlink>
+        </w:p>
+        <w:p>
+          <w:pPr>
+            <w:pStyle w:val="Verzeichnis1"/>
+            <w:tabs>
+              <w:tab w:val="right" w:leader="dot" w:pos="9062"/>
+            </w:tabs>
+            <w:rPr>
+              <w:rFonts w:cstheme="minorBidi"/>
+              <w:noProof/>
+              <w:kern w:val="2"/>
+              <w:sz w:val="24"/>
+              <w:szCs w:val="24"/>
+              <w14:ligatures w14:val="standardContextual"/>
+            </w:rPr>
+          </w:pPr>
+          <w:hyperlink w:anchor="_Toc221256833" w:history="1">
+            <w:r>
+              <w:rPr>
+                <w:rStyle w:val="Hyperlink"/>
+                <w:noProof/>
+              </w:rPr>
+              <w:t>5 Implementierungsphase</w:t>
+            </w:r>
+            <w:r>
+              <w:rPr>
+                <w:noProof/>
+                <w:webHidden/>
+              </w:rPr>
+              <w:tab/>
+            </w:r>
+            <w:r>
+              <w:rPr>
+                <w:noProof/>
+                <w:webHidden/>
+              </w:rPr>
+              <w:fldChar w:fldCharType="begin"/>
+            </w:r>
+            <w:r>
+              <w:rPr>
+                <w:noProof/>
+                <w:webHidden/>
+              </w:rPr>
+              <w:instrText xml:space="preserve"> PAGEREF _Toc221256833 \h </w:instrText>
+            </w:r>
+            <w:r>
+              <w:rPr>
+                <w:noProof/>
+                <w:webHidden/>
+              </w:rPr>
+            </w:r>
+            <w:r>
+              <w:rPr>
+                <w:noProof/>
+                <w:webHidden/>
+              </w:rPr>
+              <w:fldChar w:fldCharType="separate"/>
+            </w:r>
+            <w:r>
+              <w:rPr>
+                <w:noProof/>
+                <w:webHidden/>
+              </w:rPr>
+              <w:t>3</w:t>
+            </w:r>
+            <w:r>
+              <w:rPr>
+                <w:noProof/>
+                <w:webHidden/>
+              </w:rPr>
+              <w:fldChar w:fldCharType="end"/>
+            </w:r>
+          </w:hyperlink>
+        </w:p>
+        <w:p>
+          <w:pPr>
+            <w:pStyle w:val="Verzeichnis2"/>
+            <w:tabs>
+              <w:tab w:val="right" w:leader="dot" w:pos="9062"/>
+            </w:tabs>
+            <w:rPr>
+              <w:rFonts w:cstheme="minorBidi"/>
+              <w:noProof/>
+              <w:kern w:val="2"/>
+              <w:sz w:val="24"/>
+              <w:szCs w:val="24"/>
+              <w14:ligatures w14:val="standardContextual"/>
+            </w:rPr>
+          </w:pPr>
+          <w:hyperlink w:anchor="_Toc221256834" w:history="1">
+            <w:r>
+              <w:rPr>
+                <w:rStyle w:val="Hyperlink"/>
+                <w:noProof/>
+              </w:rPr>
+              <w:t>5.1 Aufsetzen der Datenbank</w:t>
+            </w:r>
+            <w:r>
+              <w:rPr>
+                <w:noProof/>
+                <w:webHidden/>
+              </w:rPr>
+              <w:tab/>
+            </w:r>
+            <w:r>
+              <w:rPr>
+                <w:noProof/>
+                <w:webHidden/>
+              </w:rPr>
+              <w:fldChar w:fldCharType="begin"/>
+            </w:r>
+            <w:r>
+              <w:rPr>
+                <w:noProof/>
+                <w:webHidden/>
+              </w:rPr>
+              <w:instrText xml:space="preserve"> PAGEREF _Toc221256834 \h </w:instrText>
+            </w:r>
+            <w:r>
+              <w:rPr>
+                <w:noProof/>
+                <w:webHidden/>
+              </w:rPr>
+            </w:r>
+            <w:r>
+              <w:rPr>
+                <w:noProof/>
+                <w:webHidden/>
+              </w:rPr>
+              <w:fldChar w:fldCharType="separate"/>
+            </w:r>
+            <w:r>
+              <w:rPr>
+                <w:noProof/>
+                <w:webHidden/>
+              </w:rPr>
+              <w:t>3</w:t>
+            </w:r>
+            <w:r>
+              <w:rPr>
+                <w:noProof/>
+                <w:webHidden/>
+              </w:rPr>
+              <w:fldChar w:fldCharType="end"/>
+            </w:r>
+          </w:hyperlink>
+        </w:p>
+        <w:p>
+          <w:pPr>
+            <w:pStyle w:val="Verzeichnis2"/>
+            <w:tabs>
+              <w:tab w:val="right" w:leader="dot" w:pos="9062"/>
+            </w:tabs>
+            <w:rPr>
+              <w:rFonts w:cstheme="minorBidi"/>
+              <w:noProof/>
+              <w:kern w:val="2"/>
+              <w:sz w:val="24"/>
+              <w:szCs w:val="24"/>
+              <w14:ligatures w14:val="standardContextual"/>
+            </w:rPr>
+          </w:pPr>
+          <w:hyperlink w:anchor="_Toc221256835" w:history="1">
+            <w:r>
+              <w:rPr>
+                <w:rStyle w:val="Hyperlink"/>
+                <w:noProof/>
+              </w:rPr>
+              <w:t>5.2 Implementierung Datenbank</w:t>
+            </w:r>
+            <w:r>
+              <w:rPr>
+                <w:noProof/>
+                <w:webHidden/>
+              </w:rPr>
+              <w:tab/>
+            </w:r>
+            <w:r>
+              <w:rPr>
+                <w:noProof/>
+                <w:webHidden/>
+              </w:rPr>
+              <w:fldChar w:fldCharType="begin"/>
+            </w:r>
+            <w:r>
+              <w:rPr>
+                <w:noProof/>
+                <w:webHidden/>
+              </w:rPr>
+              <w:instrText xml:space="preserve"> PAGEREF _Toc221256835 \h </w:instrText>
+            </w:r>
+            <w:r>
+              <w:rPr>
+                <w:noProof/>
+                <w:webHidden/>
+              </w:rPr>
+            </w:r>
+            <w:r>
+              <w:rPr>
+                <w:noProof/>
+                <w:webHidden/>
+              </w:rPr>
+              <w:fldChar w:fldCharType="separate"/>
+            </w:r>
+            <w:r>
+              <w:rPr>
+                <w:noProof/>
+                <w:webHidden/>
+              </w:rPr>
+              <w:t>3</w:t>
             </w:r>
             <w:r>
               <w:rPr>
@@ -745,7 +980,7 @@
         <w:pStyle w:val="berschrift1"/>
         <w:ind w:left="0"/>
       </w:pPr>
-      <w:bookmarkStart w:id="0" w:name="_Toc221180319"/>
+      <w:bookmarkStart w:id="0" w:name="_Toc221256824"/>
       <w:r>
         <w:lastRenderedPageBreak/>
         <w:t>1 Einleitung</w:t>
@@ -761,7 +996,7 @@
         </w:numPr>
       </w:pPr>
       <w:bookmarkStart w:id="1" w:name="_Ref221180012"/>
-      <w:bookmarkStart w:id="2" w:name="_Toc221180320"/>
+      <w:bookmarkStart w:id="2" w:name="_Toc221256825"/>
       <w:r>
         <w:t>Projektbeschreibung</w:t>
       </w:r>
@@ -814,7 +1049,7 @@
         <w:pStyle w:val="berschrift2"/>
         <w:ind w:left="0"/>
       </w:pPr>
-      <w:bookmarkStart w:id="3" w:name="_Toc221180321"/>
+      <w:bookmarkStart w:id="3" w:name="_Toc221256826"/>
       <w:r>
         <w:t>1.4 Projektbegründung</w:t>
       </w:r>
@@ -833,7 +1068,7 @@
         <w:pStyle w:val="berschrift2"/>
         <w:ind w:left="0"/>
       </w:pPr>
-      <w:bookmarkStart w:id="4" w:name="_Toc221180322"/>
+      <w:bookmarkStart w:id="4" w:name="_Toc221256827"/>
       <w:r>
         <w:t>1.5 Projektschnittstellen</w:t>
       </w:r>
@@ -865,7 +1100,7 @@
         <w:pStyle w:val="berschrift2"/>
         <w:ind w:left="0"/>
       </w:pPr>
-      <w:bookmarkStart w:id="5" w:name="_Toc221180323"/>
+      <w:bookmarkStart w:id="5" w:name="_Toc221256828"/>
       <w:r>
         <w:t>1.6 Projektabgrenzung</w:t>
       </w:r>
@@ -877,7 +1112,7 @@
         <w:pStyle w:val="berschrift1"/>
         <w:ind w:left="0"/>
       </w:pPr>
-      <w:bookmarkStart w:id="6" w:name="_Toc221180324"/>
+      <w:bookmarkStart w:id="6" w:name="_Toc221256829"/>
       <w:r>
         <w:t>3 Analysephase</w:t>
       </w:r>
@@ -888,7 +1123,7 @@
         <w:pStyle w:val="berschrift2"/>
         <w:ind w:left="0"/>
       </w:pPr>
-      <w:bookmarkStart w:id="7" w:name="_Toc221180325"/>
+      <w:bookmarkStart w:id="7" w:name="_Toc221256830"/>
       <w:r>
         <w:t>3.1 Ist-Analyse</w:t>
       </w:r>
@@ -909,7 +1144,7 @@
         <w:pStyle w:val="berschrift1"/>
         <w:ind w:left="0"/>
       </w:pPr>
-      <w:bookmarkStart w:id="8" w:name="_Toc221180326"/>
+      <w:bookmarkStart w:id="8" w:name="_Toc221256831"/>
       <w:r>
         <w:t>4 Entwurfsphase</w:t>
       </w:r>
@@ -919,7 +1154,7 @@
       <w:pPr>
         <w:pStyle w:val="berschrift2"/>
       </w:pPr>
-      <w:bookmarkStart w:id="9" w:name="_Toc221180327"/>
+      <w:bookmarkStart w:id="9" w:name="_Toc221256832"/>
       <w:r>
         <w:t>4.1 Zielplattform</w:t>
       </w:r>
@@ -1029,17 +1264,21 @@
         <w:pStyle w:val="berschrift1"/>
         <w:ind w:left="0"/>
       </w:pPr>
+      <w:bookmarkStart w:id="10" w:name="_Toc221256833"/>
       <w:r>
         <w:t>5 Implementierungsphase</w:t>
       </w:r>
+      <w:bookmarkEnd w:id="10"/>
     </w:p>
     <w:p>
       <w:pPr>
         <w:pStyle w:val="berschrift2"/>
       </w:pPr>
+      <w:bookmarkStart w:id="11" w:name="_Toc221256834"/>
       <w:r>
         <w:t>5.1 Aufsetzen der Datenbank</w:t>
       </w:r>
+      <w:bookmarkEnd w:id="11"/>
     </w:p>
     <w:p>
       <w:r>
@@ -1081,9 +1320,11 @@
       <w:pPr>
         <w:pStyle w:val="berschrift2"/>
       </w:pPr>
+      <w:bookmarkStart w:id="12" w:name="_Toc221256835"/>
       <w:r>
         <w:t>5.2 Implementierung Datenbank</w:t>
       </w:r>
+      <w:bookmarkEnd w:id="12"/>
     </w:p>
     <w:p>
       <w:r>
@@ -2363,6 +2604,7 @@
   <w:style w:type="character" w:default="1" w:styleId="Absatz-Standardschriftart">
     <w:name w:val="Default Paragraph Font"/>
     <w:uiPriority w:val="1"/>
+    <w:semiHidden/>
     <w:unhideWhenUsed/>
   </w:style>
   <w:style w:type="table" w:default="1" w:styleId="NormaleTabelle">

</xml_diff>